<commit_message>
Add contact email to reports
Co-Authored-By: Claude Opus 5.5 <noreply@anthropic.com>
Claude-Session: https://claude.ai/code/session_01LS2TnJAYfAPhHvQVwUYEXP
</commit_message>
<xml_diff>
--- a/docs/concept-paper.docx
+++ b/docs/concept-paper.docx
@@ -69,7 +69,7 @@
       <w:r>
         <w:t xml:space="preserve"> The 2020 census counted 9.46 million indigenous people, about 8.7% of the population (8.21 million IPs plus 1.25 million counted as both IP and Muslim); the census classified 228 of 268 ethnic groups as indigenous; NCIP estimates more than 15 million. By early 2023, 257 ancestral domains had approved CADTs, but only 55 (22%) were fully registered. CADTs cover about 20.5% of the country's land, and conflict can increase when titling is delayed. About 37% of indigenous people (2.9 million) live in geographically isolated areas (</w:t>
       </w:r>
-      <w:hyperlink w:history="1" r:id="rId2dnxzoce2oun8dzozgtzn">
+      <w:hyperlink w:history="1" r:id="rIdlm7a8ll9il_pjhpmpjpsq">
         <w:r>
           <w:rPr>
             <w:rStyle w:val="Hyperlink"/>
@@ -671,7 +671,7 @@
       <w:r>
         <w:t xml:space="preserve">Main data source: </w:t>
       </w:r>
-      <w:hyperlink w:history="1" r:id="rIdvekdb4rb20s3otqjwhoo_">
+      <w:hyperlink w:history="1" r:id="rIdh-a24kbss8hvidogw7nj6">
         <w:r>
           <w:rPr>
             <w:rStyle w:val="Hyperlink"/>

</xml_diff>

<commit_message>
Add team leader to reports
Co-Authored-By: Claude Opus 5.5 <noreply@anthropic.com>
Claude-Session: https://claude.ai/code/session_01LS2TnJAYfAPhHvQVwUYEXP
</commit_message>
<xml_diff>
--- a/docs/concept-paper.docx
+++ b/docs/concept-paper.docx
@@ -69,7 +69,7 @@
       <w:r>
         <w:t xml:space="preserve"> The 2020 census counted 9.46 million indigenous people, about 8.7% of the population (8.21 million IPs plus 1.25 million counted as both IP and Muslim); the census classified 228 of 268 ethnic groups as indigenous; NCIP estimates more than 15 million. By early 2023, 257 ancestral domains had approved CADTs, but only 55 (22%) were fully registered. CADTs cover about 20.5% of the country's land, and conflict can increase when titling is delayed. About 37% of indigenous people (2.9 million) live in geographically isolated areas (</w:t>
       </w:r>
-      <w:hyperlink w:history="1" r:id="rIdlm7a8ll9il_pjhpmpjpsq">
+      <w:hyperlink w:history="1" r:id="rId9bg5hot610vinpxbhbcb_">
         <w:r>
           <w:rPr>
             <w:rStyle w:val="Hyperlink"/>
@@ -671,7 +671,7 @@
       <w:r>
         <w:t xml:space="preserve">Main data source: </w:t>
       </w:r>
-      <w:hyperlink w:history="1" r:id="rIdh-a24kbss8hvidogw7nj6">
+      <w:hyperlink w:history="1" r:id="rIdilxoaia4yqxmyprsq5mdo">
         <w:r>
           <w:rPr>
             <w:rStyle w:val="Hyperlink"/>

</xml_diff>